<commit_message>
docs: merge ADRs into one architecture-decisions.docx, drop status
Two changes asked for in review:

1. The five separate decision documents under docs/decisions/ now
   live in a single docs/architecture-decisions.docx with a short
   intro paragraph and the entries appended in order. New decisions
   get added to the end of the same file rather than spawning new
   files. README.docx points at it.

2. Removed the "Status: Accepted" line from every entry. It was
   process boilerplate — not useful information when every entry in
   the document is, by definition, accepted.

scripts/build-docs.js regenerates the lot. Old docs/decisions/
folder removed.
</commit_message>
<xml_diff>
--- a/docs/README.docx
+++ b/docs/README.docx
@@ -24,7 +24,7 @@
           <w:b w:val="false"/>
           <w:bCs w:val="false"/>
         </w:rPr>
-        <w:t xml:space="preserve">This folder holds the working documentation for the Joule project. Two kinds of documents live here.</w:t>
+        <w:t xml:space="preserve">This folder holds the working documentation for the Joule project. Two documents live here, plus the weekly retros.</w:t>
       </w:r>
     </w:p>
     <w:p>
@@ -37,7 +37,7 @@
           <w:b/>
           <w:bCs/>
         </w:rPr>
-        <w:t xml:space="preserve">decisions/</w:t>
+        <w:t xml:space="preserve">architecture-decisions.docx</w:t>
       </w:r>
     </w:p>
     <w:p>
@@ -49,7 +49,32 @@
           <w:b w:val="false"/>
           <w:bCs w:val="false"/>
         </w:rPr>
-        <w:t xml:space="preserve">Architecture decision records (ADRs). One file per non-trivial choice made during the build. Each ADR is dated, gives the context, says what was decided, and lists the consequences I expect to live with.</w:t>
+        <w:t xml:space="preserve">A single document collecting every non-trivial decision made during the build, in the order they were made. Each entry gives the context, says what was decided, and lists the consequences I expect to live with. New decisions are appended to the end of the same document rather than starting separate files.</w:t>
+      </w:r>
+    </w:p>
+    <w:p>
+      <w:pPr>
+        <w:pStyle w:val="Heading2"/>
+        <w:spacing w:after="120" w:before="240"/>
+      </w:pPr>
+      <w:r>
+        <w:rPr>
+          <w:b/>
+          <w:bCs/>
+        </w:rPr>
+        <w:t xml:space="preserve">weekly/</w:t>
+      </w:r>
+    </w:p>
+    <w:p>
+      <w:pPr>
+        <w:spacing w:after="120"/>
+      </w:pPr>
+      <w:r>
+        <w:rPr>
+          <w:b w:val="false"/>
+          <w:bCs w:val="false"/>
+        </w:rPr>
+        <w:t xml:space="preserve">Short retros at the end of each week. Same four sections in every entry: shipped, slipped, rescoped, reflection.</w:t>
       </w:r>
     </w:p>
     <w:p>
@@ -62,7 +87,7 @@
         <w:spacing w:after="80"/>
       </w:pPr>
       <w:r>
-        <w:t xml:space="preserve">0001 — Supabase as the platform</w:t>
+        <w:t xml:space="preserve">week-01-foundation.docx</w:t>
       </w:r>
     </w:p>
     <w:p>
@@ -75,7 +100,7 @@
         <w:spacing w:after="80"/>
       </w:pPr>
       <w:r>
-        <w:t xml:space="preserve">0002 — Vercel AI Gateway over the Anthropic SDK directly</w:t>
+        <w:t xml:space="preserve">week-02-commerce-core.docx</w:t>
       </w:r>
     </w:p>
     <w:p>
@@ -88,33 +113,7 @@
         <w:spacing w:after="80"/>
       </w:pPr>
       <w:r>
-        <w:t xml:space="preserve">0003 — Embedding-hybrid recommender</w:t>
-      </w:r>
-    </w:p>
-    <w:p>
-      <w:pPr>
-        <w:pStyle w:val="ListParagraph"/>
-        <w:numPr>
-          <w:ilvl w:val="0"/>
-          <w:numId w:val="2"/>
-        </w:numPr>
-        <w:spacing w:after="80"/>
-      </w:pPr>
-      <w:r>
-        <w:t xml:space="preserve">0004 — Paginated reviews with URL-based page state</w:t>
-      </w:r>
-    </w:p>
-    <w:p>
-      <w:pPr>
-        <w:pStyle w:val="ListParagraph"/>
-        <w:numPr>
-          <w:ilvl w:val="0"/>
-          <w:numId w:val="2"/>
-        </w:numPr>
-        <w:spacing w:after="80"/>
-      </w:pPr>
-      <w:r>
-        <w:t xml:space="preserve">0005 — Refuse to write a verdict for cross-category comparisons</w:t>
+        <w:t xml:space="preserve">week-03-intelligence.docx</w:t>
       </w:r>
     </w:p>
     <w:p>
@@ -127,7 +126,7 @@
           <w:b/>
           <w:bCs/>
         </w:rPr>
-        <w:t xml:space="preserve">weekly/</w:t>
+        <w:t xml:space="preserve">How to use this folder</w:t>
       </w:r>
     </w:p>
     <w:p>
@@ -139,71 +138,7 @@
           <w:b w:val="false"/>
           <w:bCs w:val="false"/>
         </w:rPr>
-        <w:t xml:space="preserve">Short retros at the end of each week. Same three sections in every entry: shipped, slipped, rescoped. Plus a reflection paragraph when something is worth flagging for the next week.</w:t>
-      </w:r>
-    </w:p>
-    <w:p>
-      <w:pPr>
-        <w:pStyle w:val="ListParagraph"/>
-        <w:numPr>
-          <w:ilvl w:val="0"/>
-          <w:numId w:val="2"/>
-        </w:numPr>
-        <w:spacing w:after="80"/>
-      </w:pPr>
-      <w:r>
-        <w:t xml:space="preserve">week-01-foundation.docx</w:t>
-      </w:r>
-    </w:p>
-    <w:p>
-      <w:pPr>
-        <w:pStyle w:val="ListParagraph"/>
-        <w:numPr>
-          <w:ilvl w:val="0"/>
-          <w:numId w:val="2"/>
-        </w:numPr>
-        <w:spacing w:after="80"/>
-      </w:pPr>
-      <w:r>
-        <w:t xml:space="preserve">week-02-commerce-core.docx</w:t>
-      </w:r>
-    </w:p>
-    <w:p>
-      <w:pPr>
-        <w:pStyle w:val="ListParagraph"/>
-        <w:numPr>
-          <w:ilvl w:val="0"/>
-          <w:numId w:val="2"/>
-        </w:numPr>
-        <w:spacing w:after="80"/>
-      </w:pPr>
-      <w:r>
-        <w:t xml:space="preserve">week-03-intelligence.docx</w:t>
-      </w:r>
-    </w:p>
-    <w:p>
-      <w:pPr>
-        <w:pStyle w:val="Heading2"/>
-        <w:spacing w:after="120" w:before="240"/>
-      </w:pPr>
-      <w:r>
-        <w:rPr>
-          <w:b/>
-          <w:bCs/>
-        </w:rPr>
-        <w:t xml:space="preserve">How to use this folder</w:t>
-      </w:r>
-    </w:p>
-    <w:p>
-      <w:pPr>
-        <w:spacing w:after="120"/>
-      </w:pPr>
-      <w:r>
-        <w:rPr>
-          <w:b w:val="false"/>
-          <w:bCs w:val="false"/>
-        </w:rPr>
-        <w:t xml:space="preserve">The ADRs and retros are reference material, not gates. Pull requests can cite them. New decisions go in as new ADRs rather than rewriting old ones.</w:t>
+        <w:t xml:space="preserve">The decisions doc and the retros are reference material, not gates. Pull requests can cite them. Older decisions are not rewritten — a new entry that supersedes an older one says so explicitly.</w:t>
       </w:r>
     </w:p>
     <w:sectPr>

</xml_diff>